<commit_message>
Python for-loop replaced with vectorised NumPy operations — distances, FSPL, and J/S for all N runs are now computed in array operations in one pass, rather than creating N individual RadioSource objects. For large N (e.g. 10,000+) this will be substantially faster.
</commit_message>
<xml_diff>
--- a/JARS_User_guide.docx
+++ b/JARS_User_guide.docx
@@ -28,30 +28,12 @@
     </w:p>
     <w:p>
       <w:r>
-        <w:t>Receiver sensitivity describes the weakest signal that a receiver can reliably detect and decode. Think of it like</w:t>
-      </w:r>
-      <w:r>
-        <w:t xml:space="preserve"> </w:t>
-      </w:r>
-      <w:r>
-        <w:t>the hearing threshold of a person — below a certain volume, they simply cannot make out what is being said, no</w:t>
-      </w:r>
-      <w:r>
-        <w:t xml:space="preserve"> </w:t>
-      </w:r>
-      <w:r>
-        <w:t>matter how quiet the background noise is.</w:t>
-      </w:r>
-    </w:p>
-    <w:p>
-      <w:r>
-        <w:t>In JARS, sensitivity is entered in dBm (decibel-milliwatts). This is a standard unit used in radio engineering to</w:t>
-      </w:r>
-      <w:r>
-        <w:t xml:space="preserve"> </w:t>
-      </w:r>
-      <w:r>
-        <w:t>express power levels on a logarithmic scale referenced to 1 milliwatt.</w:t>
+        <w:t>Receiver sensitivity describes the weakest signal that a receiver can reliably detect and decode. Think of it like the hearing threshold of a person — below a certain volume, they simply cannot make out what is being said, no matter how quiet the background noise is.</w:t>
+      </w:r>
+    </w:p>
+    <w:p>
+      <w:r>
+        <w:t>In JARS, sensitivity is entered in dBm (decibel-milliwatts). This is a standard unit used in radio engineering to express power levels on a logarithmic scale referenced to 1 milliwatt.</w:t>
       </w:r>
     </w:p>
     <w:p>
@@ -120,10 +102,7 @@
           </w:tcPr>
           <w:p>
             <w:r>
-              <w:t xml:space="preserve">0 </w:t>
-            </w:r>
-            <w:r>
-              <w:t>dBm</w:t>
+              <w:t>0 dBm</w:t>
             </w:r>
           </w:p>
         </w:tc>
@@ -217,13 +196,7 @@
     <w:p/>
     <w:p>
       <w:r>
-        <w:t>Key rule: a more negative number means a more sensitive receiver. A receiver with a sensitivity of −100 dBm can</w:t>
-      </w:r>
-      <w:r>
-        <w:t xml:space="preserve"> </w:t>
-      </w:r>
-      <w:r>
-        <w:t>detect weaker signals than one with a sensitivity of −70 dBm.</w:t>
+        <w:t>Key rule: a more negative number means a more sensitive receiver. A receiver with a sensitivity of −100 dBm can detect weaker signals than one with a sensitivity of −70 dBm.</w:t>
       </w:r>
     </w:p>
     <w:p>
@@ -264,10 +237,7 @@
         </w:numPr>
       </w:pPr>
       <w:r>
-        <w:t>A high-performance or military receiver: −100 to −120 dBm</w:t>
-      </w:r>
-      <w:r>
-        <w:t>.</w:t>
+        <w:t>A high-performance or military receiver: −100 to −120 dBm.</w:t>
       </w:r>
     </w:p>
     <w:p>
@@ -280,36 +250,12 @@
     </w:p>
     <w:p>
       <w:r>
-        <w:t>This message appears on the JARS Geometry Plot when the received signal from the transmitter arrives at the</w:t>
-      </w:r>
-      <w:r>
-        <w:t xml:space="preserve"> </w:t>
-      </w:r>
-      <w:r>
-        <w:t xml:space="preserve">  receiver below its sensitivity threshold — meaning the signal is too faint for the receiver to detect at all,</w:t>
-      </w:r>
-      <w:r>
-        <w:t xml:space="preserve"> </w:t>
-      </w:r>
-      <w:r>
-        <w:t>regardless of any jamming.</w:t>
-      </w:r>
-    </w:p>
-    <w:p>
-      <w:r>
-        <w:t>The simulation calculates the received signal power using the Free Space Path Loss (FSPL) formula, which accounts</w:t>
-      </w:r>
-      <w:r>
-        <w:t xml:space="preserve"> </w:t>
-      </w:r>
-      <w:r>
-        <w:t>for the distance between transmitter and receiver and the operating frequency. If the result falls below the</w:t>
-      </w:r>
-      <w:r>
-        <w:t xml:space="preserve"> </w:t>
-      </w:r>
-      <w:r>
-        <w:t>sensitivity value you entered, the receiver cannot "hear" the transmitter.</w:t>
+        <w:t>This message appears on the JARS Geometry Plot when the received signal from the transmitter arrives at the   receiver below its sensitivity threshold — meaning the signal is too faint for the receiver to detect at all, regardless of any jamming.</w:t>
+      </w:r>
+    </w:p>
+    <w:p>
+      <w:r>
+        <w:t>The simulation calculates the received signal power using the Free Space Path Loss (FSPL) formula, which accounts for the distance between transmitter and receiver and the operating frequency. If the result falls below the sensitivity value you entered, the receiver cannot "hear" the transmitter.</w:t>
       </w:r>
     </w:p>
     <w:p>
@@ -413,13 +359,7 @@
           </w:tcPr>
           <w:p>
             <w:r>
-              <w:t xml:space="preserve">Communication </w:t>
-            </w:r>
-            <w:r>
-              <w:t>blocked (</w:t>
-            </w:r>
-            <w:r>
-              <w:t>jammed)</w:t>
+              <w:t>Communication blocked (jammed)</w:t>
             </w:r>
           </w:p>
         </w:tc>
@@ -429,10 +369,7 @@
           </w:tcPr>
           <w:p>
             <w:r>
-              <w:t>The signal is receivable, but the jammer's interference is strong enough to</w:t>
-            </w:r>
-            <w:r>
-              <w:t xml:space="preserve"> </w:t>
+              <w:t xml:space="preserve">The signal is receivable, but the jammer's interference is strong enough to </w:t>
             </w:r>
             <w:r>
               <w:t>overwhelm it (J/S ratio exceeds the threshold)</w:t>
@@ -447,13 +384,7 @@
     <w:p/>
     <w:p>
       <w:r>
-        <w:t>Note that when the signal is too weak, jamming success is also reported as zero — the jammer cannot disrupt a link</w:t>
-      </w:r>
-      <w:r>
-        <w:t xml:space="preserve"> </w:t>
-      </w:r>
-      <w:r>
-        <w:t>that was never viable in the first place.</w:t>
+        <w:t>Note that when the signal is too weak, jamming success is also reported as zero — the jammer cannot disrupt a link that was never viable in the first place.</w:t>
       </w:r>
     </w:p>
     <w:p>
@@ -497,13 +428,15 @@
         </w:numPr>
       </w:pPr>
       <w:r>
-        <w:t>The sensitivity value is not negative enough. If you entered, for example, −50 when the receiver is actually</w:t>
-      </w:r>
-      <w:r>
-        <w:t xml:space="preserve"> </w:t>
-      </w:r>
-      <w:r>
-        <w:t>capable of −95 dBm, the simulation will falsely conclude the link has failed. Double-check that the sensitivity</w:t>
+        <w:t xml:space="preserve">The sensitivity value is not negative enough. If you entered, for example, −50 when the receiver is </w:t>
+      </w:r>
+      <w:proofErr w:type="gramStart"/>
+      <w:r>
+        <w:t>actually capable</w:t>
+      </w:r>
+      <w:proofErr w:type="gramEnd"/>
+      <w:r>
+        <w:t xml:space="preserve"> of −95 dBm, the simulation will falsely conclude the link has failed. Double-check that the sensitivity</w:t>
       </w:r>
       <w:r>
         <w:t xml:space="preserve"> </w:t>
@@ -540,19 +473,7 @@
     </w:p>
     <w:p>
       <w:r>
-        <w:t>Every radio receiver generates a small amount of internal thermal noise, and the environment adds further noise</w:t>
-      </w:r>
-      <w:r>
-        <w:t xml:space="preserve"> </w:t>
-      </w:r>
-      <w:r>
-        <w:t>from atmospheric and man-made sources. The noise floor is the power level of this background noise — it sets the</w:t>
-      </w:r>
-      <w:r>
-        <w:t xml:space="preserve"> </w:t>
-      </w:r>
-      <w:r>
-        <w:t xml:space="preserve">  absolute lower limit below which no signal can ever be recovered, regardless of how sensitive the receiver is.</w:t>
+        <w:t>Every radio receiver generates a small amount of internal thermal noise, and the environment adds further noise from atmospheric and man-made sources. The noise floor is the power level of this background noise — it sets the   absolute lower limit below which no signal can ever be recovered, regardless of how sensitive the receiver is.</w:t>
       </w:r>
     </w:p>
     <w:p>
@@ -687,7 +608,15 @@
         <w:t xml:space="preserve"> </w:t>
       </w:r>
       <w:r>
-        <w:t>sensitivity in datasheets. As long as you use a realistic, datasheet-derived figure, the simulation will behave</w:t>
+        <w:t xml:space="preserve">sensitivity in datasheets. </w:t>
+      </w:r>
+      <w:proofErr w:type="gramStart"/>
+      <w:r>
+        <w:t>As long as</w:t>
+      </w:r>
+      <w:proofErr w:type="gramEnd"/>
+      <w:r>
+        <w:t xml:space="preserve"> you use a realistic, datasheet-derived figure, the simulation will behave</w:t>
       </w:r>
       <w:r>
         <w:t xml:space="preserve"> </w:t>
@@ -698,7 +627,15 @@
     </w:p>
     <w:p>
       <w:r>
-        <w:t xml:space="preserve">If you want the simulation to reflect noise floor effects more rigorously, the model would need to be extended with </w:t>
+        <w:t xml:space="preserve">If you want the simulation to reflect noise floor effects more rigorously, the model </w:t>
+      </w:r>
+      <w:proofErr w:type="gramStart"/>
+      <w:r>
+        <w:t>would</w:t>
+      </w:r>
+      <w:proofErr w:type="gramEnd"/>
+      <w:r>
+        <w:t xml:space="preserve"> need to be extended with </w:t>
       </w:r>
       <w:r>
         <w:t>r</w:t>
@@ -707,6 +644,367 @@
         <w:t>eceiver bandwidth and noise figure inputs, deriving the sensitivity threshold from those rather than accepting it   directly.</w:t>
       </w:r>
     </w:p>
+    <w:p>
+      <w:pPr>
+        <w:pStyle w:val="Heading3"/>
+      </w:pPr>
+      <w:r>
+        <w:t>Communication blocked (jammed)</w:t>
+      </w:r>
+    </w:p>
+    <w:p>
+      <w:r>
+        <w:t>This status appears on the geometry plot when the jammer has successfully disrupted communications. It means:</w:t>
+      </w:r>
+    </w:p>
+    <w:p>
+      <w:pPr>
+        <w:pStyle w:val="ListParagraph"/>
+        <w:numPr>
+          <w:ilvl w:val="0"/>
+          <w:numId w:val="7"/>
+        </w:numPr>
+      </w:pPr>
+      <w:r>
+        <w:t>The Tx signal was strong enough to reach the Rx (above receiver sensitivity)</w:t>
+      </w:r>
+    </w:p>
+    <w:p>
+      <w:pPr>
+        <w:pStyle w:val="ListParagraph"/>
+        <w:numPr>
+          <w:ilvl w:val="0"/>
+          <w:numId w:val="7"/>
+        </w:numPr>
+      </w:pPr>
+      <w:r>
+        <w:t>But the jammer signal overpowered it — the J/S ratio exceeded the threshold</w:t>
+      </w:r>
+      <w:r>
+        <w:t>.</w:t>
+      </w:r>
+    </w:p>
+    <w:p>
+      <w:r>
+        <w:t>This is distinct from "Communication blocked (signal too weak)", where the Tx signal couldn't reach the Rx</w:t>
+      </w:r>
+      <w:r>
+        <w:t xml:space="preserve"> </w:t>
+      </w:r>
+      <w:r>
+        <w:t>regardless of jamming.</w:t>
+      </w:r>
+    </w:p>
+    <w:p>
+      <w:r>
+        <w:t>The geometry plot annotates two link paths:</w:t>
+      </w:r>
+    </w:p>
+    <w:tbl>
+      <w:tblPr>
+        <w:tblStyle w:val="TableGrid"/>
+        <w:tblW w:w="0" w:type="auto"/>
+        <w:tblLook w:val="04A0" w:firstRow="1" w:lastRow="0" w:firstColumn="1" w:lastColumn="0" w:noHBand="0" w:noVBand="1"/>
+      </w:tblPr>
+      <w:tblGrid>
+        <w:gridCol w:w="2830"/>
+        <w:gridCol w:w="6186"/>
+      </w:tblGrid>
+      <w:tr>
+        <w:tc>
+          <w:tcPr>
+            <w:tcW w:w="2830" w:type="dxa"/>
+            <w:shd w:val="clear" w:color="auto" w:fill="D9D9D9" w:themeFill="background1" w:themeFillShade="D9"/>
+          </w:tcPr>
+          <w:p>
+            <w:pPr>
+              <w:rPr>
+                <w:b/>
+                <w:bCs/>
+              </w:rPr>
+            </w:pPr>
+            <w:r>
+              <w:rPr>
+                <w:b/>
+                <w:bCs/>
+              </w:rPr>
+              <w:t>Annotation</w:t>
+            </w:r>
+          </w:p>
+        </w:tc>
+        <w:tc>
+          <w:tcPr>
+            <w:tcW w:w="6186" w:type="dxa"/>
+            <w:shd w:val="clear" w:color="auto" w:fill="D9D9D9" w:themeFill="background1" w:themeFillShade="D9"/>
+          </w:tcPr>
+          <w:p>
+            <w:pPr>
+              <w:rPr>
+                <w:b/>
+                <w:bCs/>
+              </w:rPr>
+            </w:pPr>
+            <w:r>
+              <w:rPr>
+                <w:b/>
+                <w:bCs/>
+              </w:rPr>
+              <w:t>What it shows</w:t>
+            </w:r>
+          </w:p>
+        </w:tc>
+      </w:tr>
+      <w:tr>
+        <w:tc>
+          <w:tcPr>
+            <w:tcW w:w="2830" w:type="dxa"/>
+          </w:tcPr>
+          <w:p>
+            <w:r>
+              <w:t xml:space="preserve">Tx → Rx </w:t>
+            </w:r>
+            <w:proofErr w:type="spellStart"/>
+            <w:r>
+              <w:t>x.x</w:t>
+            </w:r>
+            <w:proofErr w:type="spellEnd"/>
+            <w:r>
+              <w:t xml:space="preserve"> dBm</w:t>
+            </w:r>
+          </w:p>
+        </w:tc>
+        <w:tc>
+          <w:tcPr>
+            <w:tcW w:w="6186" w:type="dxa"/>
+          </w:tcPr>
+          <w:p>
+            <w:r>
+              <w:t>Power received at Rx from the transmitter, calculated using Free Space Path Loss from the</w:t>
+            </w:r>
+            <w:r>
+              <w:t xml:space="preserve"> </w:t>
+            </w:r>
+            <w:r>
+              <w:t>Tx position</w:t>
+            </w:r>
+            <w:r>
+              <w:t>.</w:t>
+            </w:r>
+          </w:p>
+        </w:tc>
+      </w:tr>
+      <w:tr>
+        <w:tc>
+          <w:tcPr>
+            <w:tcW w:w="2830" w:type="dxa"/>
+          </w:tcPr>
+          <w:p>
+            <w:r>
+              <w:t xml:space="preserve">Jam → Rx </w:t>
+            </w:r>
+            <w:proofErr w:type="spellStart"/>
+            <w:r>
+              <w:t>x.x</w:t>
+            </w:r>
+            <w:proofErr w:type="spellEnd"/>
+            <w:r>
+              <w:t xml:space="preserve"> dBm</w:t>
+            </w:r>
+          </w:p>
+        </w:tc>
+        <w:tc>
+          <w:tcPr>
+            <w:tcW w:w="6186" w:type="dxa"/>
+          </w:tcPr>
+          <w:p>
+            <w:r>
+              <w:t>Power received at Rx from the jammer, calculated using Free Space Path Loss from the</w:t>
+            </w:r>
+            <w:r>
+              <w:t xml:space="preserve"> </w:t>
+            </w:r>
+            <w:r>
+              <w:t>jammer position</w:t>
+            </w:r>
+            <w:r>
+              <w:t>.</w:t>
+            </w:r>
+          </w:p>
+        </w:tc>
+      </w:tr>
+    </w:tbl>
+    <w:p/>
+    <w:p>
+      <w:r>
+        <w:t>Both use the same formula:</w:t>
+      </w:r>
+    </w:p>
+    <w:p>
+      <w:pPr>
+        <w:jc w:val="center"/>
+        <w:rPr>
+          <w:i/>
+          <w:iCs/>
+        </w:rPr>
+      </w:pPr>
+      <w:r>
+        <w:rPr>
+          <w:i/>
+          <w:iCs/>
+        </w:rPr>
+        <w:t>Received power (dBm) = Transmit power (dBm) − FSPL</w:t>
+      </w:r>
+    </w:p>
+    <w:p>
+      <w:r>
+        <w:t>where FSPL = 20·log₁₀(</w:t>
+      </w:r>
+      <w:proofErr w:type="spellStart"/>
+      <w:r>
+        <w:t>distance_km</w:t>
+      </w:r>
+      <w:proofErr w:type="spellEnd"/>
+      <w:r>
+        <w:t>) + 20·log₁₀(</w:t>
+      </w:r>
+      <w:proofErr w:type="spellStart"/>
+      <w:r>
+        <w:t>frequency_MHz</w:t>
+      </w:r>
+      <w:proofErr w:type="spellEnd"/>
+      <w:r>
+        <w:t>) + 32.44</w:t>
+      </w:r>
+    </w:p>
+    <w:p>
+      <w:r>
+        <w:t>The J/S ratio is simply:</w:t>
+      </w:r>
+    </w:p>
+    <w:p/>
+    <w:p>
+      <w:pPr>
+        <w:jc w:val="center"/>
+        <w:rPr>
+          <w:i/>
+          <w:iCs/>
+        </w:rPr>
+      </w:pPr>
+      <w:r>
+        <w:rPr>
+          <w:i/>
+          <w:iCs/>
+        </w:rPr>
+        <w:lastRenderedPageBreak/>
+        <w:t xml:space="preserve">J/S (dB) = </w:t>
+      </w:r>
+      <w:proofErr w:type="spellStart"/>
+      <w:r>
+        <w:rPr>
+          <w:i/>
+          <w:iCs/>
+        </w:rPr>
+        <w:t>Jam→Rx</w:t>
+      </w:r>
+      <w:proofErr w:type="spellEnd"/>
+      <w:r>
+        <w:rPr>
+          <w:i/>
+          <w:iCs/>
+        </w:rPr>
+        <w:t xml:space="preserve"> (dBm) − </w:t>
+      </w:r>
+      <w:proofErr w:type="spellStart"/>
+      <w:r>
+        <w:rPr>
+          <w:i/>
+          <w:iCs/>
+        </w:rPr>
+        <w:t>Tx→Rx</w:t>
+      </w:r>
+      <w:proofErr w:type="spellEnd"/>
+      <w:r>
+        <w:rPr>
+          <w:i/>
+          <w:iCs/>
+        </w:rPr>
+        <w:t xml:space="preserve"> (dBm)</w:t>
+      </w:r>
+    </w:p>
+    <w:p>
+      <w:r>
+        <w:t>When J/S exceeds the threshold, jamming is successful. So</w:t>
+      </w:r>
+      <w:r>
+        <w:t xml:space="preserve">, </w:t>
+      </w:r>
+      <w:r>
+        <w:t>the user can read directly from the two annotated dBm</w:t>
+      </w:r>
+      <w:r>
+        <w:t xml:space="preserve"> </w:t>
+      </w:r>
+      <w:r>
+        <w:t>values:</w:t>
+      </w:r>
+    </w:p>
+    <w:p>
+      <w:pPr>
+        <w:pStyle w:val="ListParagraph"/>
+        <w:numPr>
+          <w:ilvl w:val="0"/>
+          <w:numId w:val="8"/>
+        </w:numPr>
+      </w:pPr>
+      <w:r>
+        <w:t xml:space="preserve">If </w:t>
+      </w:r>
+      <w:proofErr w:type="spellStart"/>
+      <w:r>
+        <w:t>Jam→Rx</w:t>
+      </w:r>
+      <w:proofErr w:type="spellEnd"/>
+      <w:r>
+        <w:t xml:space="preserve"> dBm is significantly higher than </w:t>
+      </w:r>
+      <w:proofErr w:type="spellStart"/>
+      <w:r>
+        <w:t>Tx→Rx</w:t>
+      </w:r>
+      <w:proofErr w:type="spellEnd"/>
+      <w:r>
+        <w:t xml:space="preserve"> dBm, the jammer is winning — the J/S is positive and large.</w:t>
+      </w:r>
+    </w:p>
+    <w:p>
+      <w:pPr>
+        <w:pStyle w:val="ListParagraph"/>
+        <w:numPr>
+          <w:ilvl w:val="0"/>
+          <w:numId w:val="8"/>
+        </w:numPr>
+      </w:pPr>
+      <w:r>
+        <w:t xml:space="preserve">The larger the gap between </w:t>
+      </w:r>
+      <w:proofErr w:type="spellStart"/>
+      <w:r>
+        <w:t>Jam→Rx</w:t>
+      </w:r>
+      <w:proofErr w:type="spellEnd"/>
+      <w:r>
+        <w:t xml:space="preserve"> and </w:t>
+      </w:r>
+      <w:proofErr w:type="spellStart"/>
+      <w:r>
+        <w:t>Tx→Rx</w:t>
+      </w:r>
+      <w:proofErr w:type="spellEnd"/>
+      <w:r>
+        <w:t>, the more effective the jamming.</w:t>
+      </w:r>
+    </w:p>
+    <w:p/>
     <w:sectPr>
       <w:pgSz w:w="11906" w:h="16838"/>
       <w:pgMar w:top="1440" w:right="1440" w:bottom="1440" w:left="1440" w:header="708" w:footer="708" w:gutter="0"/>
@@ -833,6 +1131,119 @@
     </w:lvl>
   </w:abstractNum>
   <w:abstractNum w:abstractNumId="1" w15:restartNumberingAfterBreak="0">
+    <w:nsid w:val="09AF27C4"/>
+    <w:multiLevelType w:val="hybridMultilevel"/>
+    <w:tmpl w:val="8BA8323E"/>
+    <w:lvl w:ilvl="0" w:tplc="08090001">
+      <w:start w:val="1"/>
+      <w:numFmt w:val="bullet"/>
+      <w:lvlText w:val=""/>
+      <w:lvlJc w:val="left"/>
+      <w:pPr>
+        <w:ind w:left="720" w:hanging="360"/>
+      </w:pPr>
+      <w:rPr>
+        <w:rFonts w:ascii="Symbol" w:hAnsi="Symbol" w:hint="default"/>
+      </w:rPr>
+    </w:lvl>
+    <w:lvl w:ilvl="1" w:tplc="08090003" w:tentative="1">
+      <w:start w:val="1"/>
+      <w:numFmt w:val="bullet"/>
+      <w:lvlText w:val="o"/>
+      <w:lvlJc w:val="left"/>
+      <w:pPr>
+        <w:ind w:left="1440" w:hanging="360"/>
+      </w:pPr>
+      <w:rPr>
+        <w:rFonts w:ascii="Courier New" w:hAnsi="Courier New" w:cs="Courier New" w:hint="default"/>
+      </w:rPr>
+    </w:lvl>
+    <w:lvl w:ilvl="2" w:tplc="08090005" w:tentative="1">
+      <w:start w:val="1"/>
+      <w:numFmt w:val="bullet"/>
+      <w:lvlText w:val=""/>
+      <w:lvlJc w:val="left"/>
+      <w:pPr>
+        <w:ind w:left="2160" w:hanging="360"/>
+      </w:pPr>
+      <w:rPr>
+        <w:rFonts w:ascii="Wingdings" w:hAnsi="Wingdings" w:hint="default"/>
+      </w:rPr>
+    </w:lvl>
+    <w:lvl w:ilvl="3" w:tplc="08090001" w:tentative="1">
+      <w:start w:val="1"/>
+      <w:numFmt w:val="bullet"/>
+      <w:lvlText w:val=""/>
+      <w:lvlJc w:val="left"/>
+      <w:pPr>
+        <w:ind w:left="2880" w:hanging="360"/>
+      </w:pPr>
+      <w:rPr>
+        <w:rFonts w:ascii="Symbol" w:hAnsi="Symbol" w:hint="default"/>
+      </w:rPr>
+    </w:lvl>
+    <w:lvl w:ilvl="4" w:tplc="08090003" w:tentative="1">
+      <w:start w:val="1"/>
+      <w:numFmt w:val="bullet"/>
+      <w:lvlText w:val="o"/>
+      <w:lvlJc w:val="left"/>
+      <w:pPr>
+        <w:ind w:left="3600" w:hanging="360"/>
+      </w:pPr>
+      <w:rPr>
+        <w:rFonts w:ascii="Courier New" w:hAnsi="Courier New" w:cs="Courier New" w:hint="default"/>
+      </w:rPr>
+    </w:lvl>
+    <w:lvl w:ilvl="5" w:tplc="08090005" w:tentative="1">
+      <w:start w:val="1"/>
+      <w:numFmt w:val="bullet"/>
+      <w:lvlText w:val=""/>
+      <w:lvlJc w:val="left"/>
+      <w:pPr>
+        <w:ind w:left="4320" w:hanging="360"/>
+      </w:pPr>
+      <w:rPr>
+        <w:rFonts w:ascii="Wingdings" w:hAnsi="Wingdings" w:hint="default"/>
+      </w:rPr>
+    </w:lvl>
+    <w:lvl w:ilvl="6" w:tplc="08090001" w:tentative="1">
+      <w:start w:val="1"/>
+      <w:numFmt w:val="bullet"/>
+      <w:lvlText w:val=""/>
+      <w:lvlJc w:val="left"/>
+      <w:pPr>
+        <w:ind w:left="5040" w:hanging="360"/>
+      </w:pPr>
+      <w:rPr>
+        <w:rFonts w:ascii="Symbol" w:hAnsi="Symbol" w:hint="default"/>
+      </w:rPr>
+    </w:lvl>
+    <w:lvl w:ilvl="7" w:tplc="08090003" w:tentative="1">
+      <w:start w:val="1"/>
+      <w:numFmt w:val="bullet"/>
+      <w:lvlText w:val="o"/>
+      <w:lvlJc w:val="left"/>
+      <w:pPr>
+        <w:ind w:left="5760" w:hanging="360"/>
+      </w:pPr>
+      <w:rPr>
+        <w:rFonts w:ascii="Courier New" w:hAnsi="Courier New" w:cs="Courier New" w:hint="default"/>
+      </w:rPr>
+    </w:lvl>
+    <w:lvl w:ilvl="8" w:tplc="08090005" w:tentative="1">
+      <w:start w:val="1"/>
+      <w:numFmt w:val="bullet"/>
+      <w:lvlText w:val=""/>
+      <w:lvlJc w:val="left"/>
+      <w:pPr>
+        <w:ind w:left="6480" w:hanging="360"/>
+      </w:pPr>
+      <w:rPr>
+        <w:rFonts w:ascii="Wingdings" w:hAnsi="Wingdings" w:hint="default"/>
+      </w:rPr>
+    </w:lvl>
+  </w:abstractNum>
+  <w:abstractNum w:abstractNumId="2" w15:restartNumberingAfterBreak="0">
     <w:nsid w:val="152A2D52"/>
     <w:multiLevelType w:val="hybridMultilevel"/>
     <w:tmpl w:val="CDFA9E1A"/>
@@ -945,7 +1356,7 @@
       </w:rPr>
     </w:lvl>
   </w:abstractNum>
-  <w:abstractNum w:abstractNumId="2" w15:restartNumberingAfterBreak="0">
+  <w:abstractNum w:abstractNumId="3" w15:restartNumberingAfterBreak="0">
     <w:nsid w:val="476D5C1E"/>
     <w:multiLevelType w:val="hybridMultilevel"/>
     <w:tmpl w:val="82BE599C"/>
@@ -1057,7 +1468,7 @@
       </w:rPr>
     </w:lvl>
   </w:abstractNum>
-  <w:abstractNum w:abstractNumId="3" w15:restartNumberingAfterBreak="0">
+  <w:abstractNum w:abstractNumId="4" w15:restartNumberingAfterBreak="0">
     <w:nsid w:val="52AC5C01"/>
     <w:multiLevelType w:val="hybridMultilevel"/>
     <w:tmpl w:val="BAC494FC"/>
@@ -1170,7 +1581,120 @@
       </w:rPr>
     </w:lvl>
   </w:abstractNum>
-  <w:abstractNum w:abstractNumId="4" w15:restartNumberingAfterBreak="0">
+  <w:abstractNum w:abstractNumId="5" w15:restartNumberingAfterBreak="0">
+    <w:nsid w:val="74650E58"/>
+    <w:multiLevelType w:val="hybridMultilevel"/>
+    <w:tmpl w:val="001A591C"/>
+    <w:lvl w:ilvl="0" w:tplc="08090001">
+      <w:start w:val="1"/>
+      <w:numFmt w:val="bullet"/>
+      <w:lvlText w:val=""/>
+      <w:lvlJc w:val="left"/>
+      <w:pPr>
+        <w:ind w:left="720" w:hanging="360"/>
+      </w:pPr>
+      <w:rPr>
+        <w:rFonts w:ascii="Symbol" w:hAnsi="Symbol" w:hint="default"/>
+      </w:rPr>
+    </w:lvl>
+    <w:lvl w:ilvl="1" w:tplc="08090003" w:tentative="1">
+      <w:start w:val="1"/>
+      <w:numFmt w:val="bullet"/>
+      <w:lvlText w:val="o"/>
+      <w:lvlJc w:val="left"/>
+      <w:pPr>
+        <w:ind w:left="1440" w:hanging="360"/>
+      </w:pPr>
+      <w:rPr>
+        <w:rFonts w:ascii="Courier New" w:hAnsi="Courier New" w:cs="Courier New" w:hint="default"/>
+      </w:rPr>
+    </w:lvl>
+    <w:lvl w:ilvl="2" w:tplc="08090005" w:tentative="1">
+      <w:start w:val="1"/>
+      <w:numFmt w:val="bullet"/>
+      <w:lvlText w:val=""/>
+      <w:lvlJc w:val="left"/>
+      <w:pPr>
+        <w:ind w:left="2160" w:hanging="360"/>
+      </w:pPr>
+      <w:rPr>
+        <w:rFonts w:ascii="Wingdings" w:hAnsi="Wingdings" w:hint="default"/>
+      </w:rPr>
+    </w:lvl>
+    <w:lvl w:ilvl="3" w:tplc="08090001" w:tentative="1">
+      <w:start w:val="1"/>
+      <w:numFmt w:val="bullet"/>
+      <w:lvlText w:val=""/>
+      <w:lvlJc w:val="left"/>
+      <w:pPr>
+        <w:ind w:left="2880" w:hanging="360"/>
+      </w:pPr>
+      <w:rPr>
+        <w:rFonts w:ascii="Symbol" w:hAnsi="Symbol" w:hint="default"/>
+      </w:rPr>
+    </w:lvl>
+    <w:lvl w:ilvl="4" w:tplc="08090003" w:tentative="1">
+      <w:start w:val="1"/>
+      <w:numFmt w:val="bullet"/>
+      <w:lvlText w:val="o"/>
+      <w:lvlJc w:val="left"/>
+      <w:pPr>
+        <w:ind w:left="3600" w:hanging="360"/>
+      </w:pPr>
+      <w:rPr>
+        <w:rFonts w:ascii="Courier New" w:hAnsi="Courier New" w:cs="Courier New" w:hint="default"/>
+      </w:rPr>
+    </w:lvl>
+    <w:lvl w:ilvl="5" w:tplc="08090005" w:tentative="1">
+      <w:start w:val="1"/>
+      <w:numFmt w:val="bullet"/>
+      <w:lvlText w:val=""/>
+      <w:lvlJc w:val="left"/>
+      <w:pPr>
+        <w:ind w:left="4320" w:hanging="360"/>
+      </w:pPr>
+      <w:rPr>
+        <w:rFonts w:ascii="Wingdings" w:hAnsi="Wingdings" w:hint="default"/>
+      </w:rPr>
+    </w:lvl>
+    <w:lvl w:ilvl="6" w:tplc="08090001" w:tentative="1">
+      <w:start w:val="1"/>
+      <w:numFmt w:val="bullet"/>
+      <w:lvlText w:val=""/>
+      <w:lvlJc w:val="left"/>
+      <w:pPr>
+        <w:ind w:left="5040" w:hanging="360"/>
+      </w:pPr>
+      <w:rPr>
+        <w:rFonts w:ascii="Symbol" w:hAnsi="Symbol" w:hint="default"/>
+      </w:rPr>
+    </w:lvl>
+    <w:lvl w:ilvl="7" w:tplc="08090003" w:tentative="1">
+      <w:start w:val="1"/>
+      <w:numFmt w:val="bullet"/>
+      <w:lvlText w:val="o"/>
+      <w:lvlJc w:val="left"/>
+      <w:pPr>
+        <w:ind w:left="5760" w:hanging="360"/>
+      </w:pPr>
+      <w:rPr>
+        <w:rFonts w:ascii="Courier New" w:hAnsi="Courier New" w:cs="Courier New" w:hint="default"/>
+      </w:rPr>
+    </w:lvl>
+    <w:lvl w:ilvl="8" w:tplc="08090005" w:tentative="1">
+      <w:start w:val="1"/>
+      <w:numFmt w:val="bullet"/>
+      <w:lvlText w:val=""/>
+      <w:lvlJc w:val="left"/>
+      <w:pPr>
+        <w:ind w:left="6480" w:hanging="360"/>
+      </w:pPr>
+      <w:rPr>
+        <w:rFonts w:ascii="Wingdings" w:hAnsi="Wingdings" w:hint="default"/>
+      </w:rPr>
+    </w:lvl>
+  </w:abstractNum>
+  <w:abstractNum w:abstractNumId="6" w15:restartNumberingAfterBreak="0">
     <w:nsid w:val="796D0B5E"/>
     <w:multiLevelType w:val="hybridMultilevel"/>
     <w:tmpl w:val="7A92A78C"/>
@@ -1256,7 +1780,7 @@
       </w:pPr>
     </w:lvl>
   </w:abstractNum>
-  <w:abstractNum w:abstractNumId="5" w15:restartNumberingAfterBreak="0">
+  <w:abstractNum w:abstractNumId="7" w15:restartNumberingAfterBreak="0">
     <w:nsid w:val="7FE67D45"/>
     <w:multiLevelType w:val="hybridMultilevel"/>
     <w:tmpl w:val="17F224F4"/>
@@ -1369,21 +1893,27 @@
     </w:lvl>
   </w:abstractNum>
   <w:num w:numId="1" w16cid:durableId="1354652199">
-    <w:abstractNumId w:val="3"/>
+    <w:abstractNumId w:val="4"/>
   </w:num>
   <w:num w:numId="2" w16cid:durableId="1363286630">
-    <w:abstractNumId w:val="4"/>
+    <w:abstractNumId w:val="6"/>
   </w:num>
   <w:num w:numId="3" w16cid:durableId="438532377">
     <w:abstractNumId w:val="0"/>
   </w:num>
   <w:num w:numId="4" w16cid:durableId="91247567">
+    <w:abstractNumId w:val="7"/>
+  </w:num>
+  <w:num w:numId="5" w16cid:durableId="2072803491">
+    <w:abstractNumId w:val="3"/>
+  </w:num>
+  <w:num w:numId="6" w16cid:durableId="1559971780">
+    <w:abstractNumId w:val="2"/>
+  </w:num>
+  <w:num w:numId="7" w16cid:durableId="299268527">
     <w:abstractNumId w:val="5"/>
   </w:num>
-  <w:num w:numId="5" w16cid:durableId="2072803491">
-    <w:abstractNumId w:val="2"/>
-  </w:num>
-  <w:num w:numId="6" w16cid:durableId="1559971780">
+  <w:num w:numId="8" w16cid:durableId="1933737615">
     <w:abstractNumId w:val="1"/>
   </w:num>
 </w:numbering>
@@ -1990,6 +2520,7 @@
   <w:style w:type="character" w:default="1" w:styleId="DefaultParagraphFont">
     <w:name w:val="Default Paragraph Font"/>
     <w:uiPriority w:val="1"/>
+    <w:semiHidden/>
     <w:unhideWhenUsed/>
   </w:style>
   <w:style w:type="table" w:default="1" w:styleId="TableNormal">

</xml_diff>